<commit_message>
Le test des deux vies sur v1.79 : la cible des taps n'est pas atteinte
Deux vies COMPLETES rejouees sur le build publie (167 ecrans, 53 decisions,
0 erreur) + tools/rythme.py, qui mesure ce que le banc ne savait pas faire :
les taps de lecture avant decision sur une vie entiere.

  v1.59 : 1,98 tap · 36 % des decisions a un tap ou moins
  v1.79 : 1,79 tap · 38 %  -> la cible du §10 (la majorite) N'EST PAS atteinte

Et la critique de ChatGPT sur la longueur des textes etait fondee : la
mediane par ecran (34 mots) est bonne, mais 46 % des ecrans depassent 45
mots et la queue monte a 149. Les rafales de 3 taps tombent toutes sur des
ecrans de TEXTE, jamais sur des menus.

CORRECTION inscrite au rapport : mon argument « la mediane est deja a 55
mots » comparait le total d'une SCENE, pas ce que le joueur voit par ECRAN.
Le refus de la cible est retire.

Co-Authored-By: Claude Opus 5 <noreply@anthropic.com>
Claude-Session: https://claude.ai/code/session_015My4MqrUD9CADDLuz9Wdmt
</commit_message>
<xml_diff>
--- a/data/PACTUM-feedback-fluidite-rapport.docx
+++ b/data/PACTUM-feedback-fluidite-rapport.docx
@@ -89,13 +89,39 @@
         <w:rPr>
           <w:b/>
         </w:rPr>
-        <w:t>Conséquence : le levier n'est pas l'écriture, c'est l'ASSEMBLAGE.</w:t>
+        <w:t>Conséquence : une part du levier n'est pas l'écriture, c'est l'ASSEMBLAGE.</w:t>
       </w:r>
       <w:r>
         <w:rPr>
           <w:b w:val="0"/>
         </w:rPr>
-        <w:t xml:space="preserve"> Aucune des lignes lourdes mesurées (serment-hameau 2,7 taps ; marche-muet 1,8 ; tour-de-guet 1,5) n'est corrigeable en raccourcissant un paragraphe. C'est pourquoi la cible « 25-45 mots par scène » du §10 n'a pas été appliquée : elle ferait perdre de la prose sans gagner un tap. La médiane est déjà à 55 mots. Si cette cible est maintenue, elle doit être traitée comme une consigne d'écriture séparée, pas comme un correctif de fluidité.</w:t>
+        <w:t xml:space="preserve"> Aucune des lignes lourdes mesurées (serment-hameau 2,7 taps ; marche-muet 1,8 ; tour-de-guet 1,5) n'est corrigeable en raccourcissant un paragraphe.</w:t>
+      </w:r>
+    </w:p>
+    <w:p>
+      <w:r>
+        <w:rPr>
+          <w:b/>
+        </w:rPr>
+        <w:t>⚠️ CORRECTION — la première version de ce rapport concluait de là qu'il ne fallait pas raccourcir les textes. C'était faux, et sur deux plans.</w:t>
+      </w:r>
+      <w:r>
+        <w:rPr>
+          <w:b w:val="0"/>
+        </w:rPr>
+        <w:t xml:space="preserve"> D'abord le chiffre : j'avançais « la médiane est déjà à 55 mots », qui est le total d'une SCÈNE, tous paragraphes confondus — pas ce que le joueur voit. Mesurée sur des vies réelles, la médiane par ÉCRAN est de </w:t>
+      </w:r>
+      <w:r>
+        <w:rPr>
+          <w:b/>
+        </w:rPr>
+        <w:t>34 mots</w:t>
+      </w:r>
+      <w:r>
+        <w:rPr>
+          <w:b w:val="0"/>
+        </w:rPr>
+        <w:t>. Ensuite le raisonnement : « raccourcir ne fait pas gagner un tap » répond à une question de fluidité, alors que la demande portait sur le RYTHME. Les deux ne sont pas la même chose. Le §7 ci-dessous donne la mesure et la cible corrigée.</w:t>
       </w:r>
     </w:p>
     <w:p>
@@ -718,13 +744,13 @@
         <w:rPr>
           <w:b/>
         </w:rPr>
-        <w:t>La cible de 25-45 mots par scène (§10).</w:t>
+        <w:t>La cible de 25-45 mots (§10).</w:t>
       </w:r>
       <w:r>
         <w:rPr>
           <w:b w:val="0"/>
         </w:rPr>
-        <w:t xml:space="preserve"> Voir §1 : le tap ressenti ne vient pas de la longueur des textes. À traiter comme une consigne d'écriture séparée si elle est maintenue.</w:t>
+        <w:t xml:space="preserve"> Elle n'est pas appliquée à ce jour — mais elle n'est plus refusée : la mesure sur vies complètes (§7) montre qu'elle est le chantier suivant, avec une cible plus précise que « raccourcir tout ».</w:t>
       </w:r>
     </w:p>
     <w:p>
@@ -824,7 +850,289 @@
         <w:rPr>
           <w:color w:val="E0632A"/>
         </w:rPr>
-        <w:t>7. Définition de « fini » (§13) — état point par point</w:t>
+        <w:t>7. LE TEST DES DEUX VIES — la mesure qui manquait</w:t>
+      </w:r>
+    </w:p>
+    <w:p>
+      <w:r>
+        <w:rPr>
+          <w:b w:val="0"/>
+        </w:rPr>
+        <w:t>Deux vies COMPLÈTES rejouées sur v1.79, une curieuse et une pressée, sur le build publié : 167 écrans, 53 décisions, 0 erreur. C'est précisément ce que le banc ne savait pas faire — il posait le héros dans un lieu et ne jouait jamais d'arrivée. Nouvel outil : `tools/rythme.py`, qui lit les transcripts de parties réelles. Une base de comparaison existe : deux vies enregistrées de la même façon sur v1.59, avant tout ce chantier.</w:t>
+      </w:r>
+    </w:p>
+    <w:p>
+      <w:r>
+        <w:rPr>
+          <w:b/>
+        </w:rPr>
+        <w:t>Taps de lecture avant une décision (la métrique du §5) :</w:t>
+      </w:r>
+    </w:p>
+    <w:p>
+      <w:r>
+        <w:rPr>
+          <w:b w:val="0"/>
+        </w:rPr>
+        <w:t xml:space="preserve">v1.59 → </w:t>
+      </w:r>
+      <w:r>
+        <w:rPr>
+          <w:b/>
+        </w:rPr>
+        <w:t>1,98</w:t>
+      </w:r>
+      <w:r>
+        <w:rPr>
+          <w:b w:val="0"/>
+        </w:rPr>
+        <w:t xml:space="preserve"> tap · 36 % des décisions à un tap ou moins</w:t>
+      </w:r>
+    </w:p>
+    <w:p>
+      <w:r>
+        <w:rPr>
+          <w:b w:val="0"/>
+        </w:rPr>
+        <w:t xml:space="preserve">v1.79 → </w:t>
+      </w:r>
+      <w:r>
+        <w:rPr>
+          <w:b/>
+        </w:rPr>
+        <w:t>1,79</w:t>
+      </w:r>
+      <w:r>
+        <w:rPr>
+          <w:b w:val="0"/>
+        </w:rPr>
+        <w:t xml:space="preserve"> tap · 38 % des décisions à un tap ou moins</w:t>
+      </w:r>
+    </w:p>
+    <w:p>
+      <w:r>
+        <w:rPr>
+          <w:b/>
+        </w:rPr>
+        <w:t>Verdict : la cible du §10 n'est PAS atteinte.</w:t>
+      </w:r>
+      <w:r>
+        <w:rPr>
+          <w:b w:val="0"/>
+        </w:rPr>
+        <w:t xml:space="preserve"> « La majorité des scènes mène à une décision après au plus un tap » demande plus de 50 % ; on est à 38 %. Le gain sur la moyenne est réel mais mince, et la part des décisions immédiates n'a quasiment pas bougé. Sur la vie pressée, c'est pire : </w:t>
+      </w:r>
+      <w:r>
+        <w:rPr>
+          <w:b/>
+        </w:rPr>
+        <w:t>19 %</w:t>
+      </w:r>
+      <w:r>
+        <w:rPr>
+          <w:b w:val="0"/>
+        </w:rPr>
+        <w:t xml:space="preserve"> seulement, et une décision sur trois demande trois taps.</w:t>
+      </w:r>
+    </w:p>
+    <w:p>
+      <w:r>
+        <w:rPr>
+          <w:b/>
+        </w:rPr>
+        <w:t>Longueur des écrans — et c'est ici que la critique du §10 était juste :</w:t>
+      </w:r>
+    </w:p>
+    <w:p>
+      <w:r>
+        <w:rPr>
+          <w:b w:val="0"/>
+        </w:rPr>
+        <w:t xml:space="preserve">médiane </w:t>
+      </w:r>
+      <w:r>
+        <w:rPr>
+          <w:b/>
+        </w:rPr>
+        <w:t>34 mots</w:t>
+      </w:r>
+      <w:r>
+        <w:rPr>
+          <w:b w:val="0"/>
+        </w:rPr>
+        <w:t xml:space="preserve"> (bonne, et à ne pas toucher)</w:t>
+      </w:r>
+    </w:p>
+    <w:p>
+      <w:r>
+        <w:rPr>
+          <w:b w:val="0"/>
+        </w:rPr>
+        <w:t xml:space="preserve">mais </w:t>
+      </w:r>
+      <w:r>
+        <w:rPr>
+          <w:b/>
+        </w:rPr>
+        <w:t>46 % des écrans dépassent 45 mots</w:t>
+      </w:r>
+      <w:r>
+        <w:rPr>
+          <w:b w:val="0"/>
+        </w:rPr>
+        <w:t>, contre 42 % sur v1.59</w:t>
+      </w:r>
+    </w:p>
+    <w:p>
+      <w:r>
+        <w:rPr>
+          <w:b w:val="0"/>
+        </w:rPr>
+        <w:t>et la queue est lourde : 149, 108, 106, 96, 94 mots sur un seul écran</w:t>
+      </w:r>
+    </w:p>
+    <w:p>
+      <w:r>
+        <w:rPr>
+          <w:b/>
+        </w:rPr>
+        <w:t>Ce n'est donc pas « tout raccourcir » qu'il faut, c'est COUPER LA QUEUE.</w:t>
+      </w:r>
+      <w:r>
+        <w:rPr>
+          <w:b w:val="0"/>
+        </w:rPr>
+        <w:t xml:space="preserve"> La médiane est déjà dans la cible ; ce sont les 46 % au-dessus de 45 mots, et surtout la poignée d'écrans à 90-150 mots, qui coûtent le tap supplémentaire. C'est une cible mesurable, et `tools/rythme.py` la vérifie.</w:t>
+      </w:r>
+    </w:p>
+    <w:p>
+      <w:r>
+        <w:rPr>
+          <w:b/>
+        </w:rPr>
+        <w:t>Où l'on tapote sans décider.</w:t>
+      </w:r>
+      <w:r>
+        <w:rPr>
+          <w:b w:val="0"/>
+        </w:rPr>
+        <w:t xml:space="preserve"> L'outil nomme les endroits où trois taps ou plus s'enchaînent sans décision. Les voici, et ils sont instructifs : ce sont tous des écrans de TEXTE, jamais des menus.</w:t>
+      </w:r>
+    </w:p>
+    <w:p>
+      <w:r>
+        <w:rPr>
+          <w:b w:val="0"/>
+        </w:rPr>
+        <w:t>« Ils ont commencé à te compter. C'est un pays méticuleux. » · « Tu ne sens rien ? Normal. On ne sent jamais le premier tour de corde. » · « Un seul écriteau détonne : le motif a été gratté au couteau… » · « Ça grince en mesure. Toutes ces cordes, un seul rythme. »</w:t>
+      </w:r>
+    </w:p>
+    <w:p>
+      <w:r>
+        <w:rPr>
+          <w:b w:val="0"/>
+        </w:rPr>
+        <w:t>Autrement dit : les sous-menus et l'assemblage d'arrivée ont bien été traités — ce qui reste, c'est la prose. La critique était fondée.</w:t>
+      </w:r>
+    </w:p>
+    <w:p>
+      <w:r>
+        <w:rPr>
+          <w:b/>
+        </w:rPr>
+        <w:t>Les autres questions posées, telles que les vies y répondent :</w:t>
+      </w:r>
+    </w:p>
+    <w:p>
+      <w:r>
+        <w:rPr>
+          <w:b/>
+        </w:rPr>
+        <w:t>« Observer » manque-t-il ?</w:t>
+      </w:r>
+      <w:r>
+        <w:rPr>
+          <w:b w:val="0"/>
+        </w:rPr>
+        <w:t xml:space="preserve"> Non — mais il est encore là : 7 apparitions dans la vie curieuse, sur les scènes hors lot pilote. Les 29 points restants se voient donc réellement en jeu.</w:t>
+      </w:r>
+    </w:p>
+    <w:p>
+      <w:r>
+        <w:rPr>
+          <w:b/>
+        </w:rPr>
+        <w:t>Les objets récompensent-ils ?</w:t>
+      </w:r>
+      <w:r>
+        <w:rPr>
+          <w:b w:val="0"/>
+        </w:rPr>
+        <w:t xml:space="preserve"> Partiellement. 3 objets gagnés par vie, mais 1 seul sorti sur la vie curieuse et 0 sur la pressée. Le nouveau geste (l'objet qui transforme la scène) fonctionne quand il est déclenché, mais il est encore trop rare pour porter une sensation de récompense. Deux objets pilotes sur douze : c'est attendu, et ça confirme qu'il faut étendre.</w:t>
+      </w:r>
+    </w:p>
+    <w:p>
+      <w:r>
+        <w:rPr>
+          <w:b/>
+        </w:rPr>
+        <w:t>Les choix reviennent-ils hanter ?</w:t>
+      </w:r>
+      <w:r>
+        <w:rPr>
+          <w:b w:val="0"/>
+        </w:rPr>
+        <w:t xml:space="preserve"> Oui, et c'est le point le plus solide : 9 à 10 échos de mémoire par vie, dont des reconnaissances explicites de personnages (« Je t'ai déjà croisé »). La chaîne « j'ai fait quelque chose → le monde l'a retenu » est en place et se voit sans qu'on la cherche.</w:t>
+      </w:r>
+    </w:p>
+    <w:p>
+      <w:r>
+        <w:rPr>
+          <w:b/>
+        </w:rPr>
+        <w:t>Ce qui ne s'est pas produit du tout :</w:t>
+      </w:r>
+      <w:r>
+        <w:rPr>
+          <w:b w:val="0"/>
+        </w:rPr>
+        <w:t xml:space="preserve"> aucun Destin ni Malédiction sur les deux vies, et le Geôlier n'a parlé qu'une fois en 167 écrans. Les moments les plus forts du jeu sont donc rares au point d'être absents d'une partie entière — c'est un sujet de dosage distinct, à regarder ensuite.</w:t>
+      </w:r>
+    </w:p>
+    <w:p>
+      <w:r>
+        <w:rPr>
+          <w:b/>
+        </w:rPr>
+        <w:t>Conclusion de ce test : le feu vert ne doit pas être donné.</w:t>
+      </w:r>
+      <w:r>
+        <w:rPr>
+          <w:b w:val="0"/>
+        </w:rPr>
+        <w:t xml:space="preserve"> Non pas parce que les correctifs livrés seraient faux — ils tiennent, et la mémoire du monde fonctionne — mais parce que la métrique qui décide, elle, n'est pas atteinte : 38 % au lieu d'une majorité. Le chantier suivant est la queue des textes, pas la généralisation des 29 points. Les deux sont à faire ; celui-là d'abord.</w:t>
+      </w:r>
+    </w:p>
+    <w:p>
+      <w:pPr>
+        <w:jc w:val="center"/>
+      </w:pPr>
+      <w:r>
+        <w:rPr>
+          <w:color w:val="E0632A"/>
+        </w:rPr>
+        <w:t>• • •</w:t>
+      </w:r>
+    </w:p>
+    <w:p>
+      <w:pPr>
+        <w:pStyle w:val="Heading1"/>
+      </w:pPr>
+      <w:r>
+        <w:rPr>
+          <w:color w:val="E0632A"/>
+        </w:rPr>
+        <w:t>8. Définition de « fini » (§13) — état point par point</w:t>
       </w:r>
     </w:p>
     <w:p>
@@ -908,7 +1216,7 @@
         <w:rPr>
           <w:b w:val="0"/>
         </w:rPr>
-        <w:t xml:space="preserve"> — non démontré : vrai sur la narration écrite, non mesurable aujourd'hui sur l'assemblage d'arrivée (voir §4).</w:t>
+        <w:t xml:space="preserve"> — NON ATTEINT, désormais mesuré : 38 % sur deux vies complètes (§7). C'est le critère qui bloque le feu vert.</w:t>
       </w:r>
     </w:p>
     <w:sectPr>

</xml_diff>